<commit_message>
Finished CPU in Logisim
</commit_message>
<xml_diff>
--- a/docs/ISA-and-opportunities-ALU.docx
+++ b/docs/ISA-and-opportunities-ALU.docx
@@ -31,6 +31,15 @@
           <w:lang w:val="en-US"/>
         </w:rPr>
         <w:t xml:space="preserve">ALU</w:t>
+      </w:r>
+      <w:r>
+        <w:rPr>
+          <w:sz w:val="28"/>
+          <w:szCs w:val="28"/>
+          <w:highlight w:val="none"/>
+          <w:lang w:val="en-US"/>
+          <w14:ligatures w14:val="none"/>
+        </w:rPr>
       </w:r>
       <w:r>
         <w:rPr>
@@ -83,6 +92,15 @@
           <w14:ligatures w14:val="none"/>
         </w:rPr>
       </w:r>
+      <w:r>
+        <w:rPr>
+          <w:sz w:val="28"/>
+          <w:szCs w:val="28"/>
+          <w:highlight w:val="none"/>
+          <w:lang w:val="uk-UA"/>
+          <w14:ligatures w14:val="none"/>
+        </w:rPr>
+      </w:r>
     </w:p>
     <w:p>
       <w:pPr>
@@ -106,6 +124,15 @@
           <w:lang w:val="uk-UA"/>
         </w:rPr>
         <w:t xml:space="preserve">10110100</w:t>
+      </w:r>
+      <w:r>
+        <w:rPr>
+          <w:sz w:val="28"/>
+          <w:szCs w:val="28"/>
+          <w:highlight w:val="none"/>
+          <w:lang w:val="uk-UA"/>
+          <w14:ligatures w14:val="none"/>
+        </w:rPr>
       </w:r>
       <w:r>
         <w:rPr>
@@ -183,6 +210,15 @@
           <w14:ligatures w14:val="none"/>
         </w:rPr>
       </w:r>
+      <w:r>
+        <w:rPr>
+          <w:sz w:val="28"/>
+          <w:szCs w:val="28"/>
+          <w:highlight w:val="none"/>
+          <w:lang w:val="uk-UA"/>
+          <w14:ligatures w14:val="none"/>
+        </w:rPr>
+      </w:r>
     </w:p>
     <w:p>
       <w:pPr>
@@ -216,6 +252,15 @@
           <w14:ligatures w14:val="none"/>
         </w:rPr>
       </w:r>
+      <w:r>
+        <w:rPr>
+          <w:sz w:val="28"/>
+          <w:szCs w:val="28"/>
+          <w:highlight w:val="none"/>
+          <w:lang w:val="uk-UA"/>
+          <w14:ligatures w14:val="none"/>
+        </w:rPr>
+      </w:r>
     </w:p>
     <w:p>
       <w:pPr>
@@ -248,6 +293,15 @@
           <w:lang w:val="uk-UA"/>
         </w:rPr>
         <w:t xml:space="preserve"> числом. </w:t>
+      </w:r>
+      <w:r>
+        <w:rPr>
+          <w:sz w:val="28"/>
+          <w:szCs w:val="28"/>
+          <w:highlight w:val="none"/>
+          <w:lang w:val="uk-UA"/>
+          <w14:ligatures w14:val="none"/>
+        </w:rPr>
       </w:r>
       <w:r>
         <w:rPr>
@@ -308,7 +362,15 @@
           <w14:ligatures w14:val="none"/>
         </w:rPr>
       </w:r>
-      <w:r/>
+      <w:r>
+        <w:rPr>
+          <w:sz w:val="28"/>
+          <w:szCs w:val="28"/>
+          <w:highlight w:val="none"/>
+          <w:lang w:val="uk-UA"/>
+          <w14:ligatures w14:val="none"/>
+        </w:rPr>
+      </w:r>
     </w:p>
     <w:p>
       <w:pPr>
@@ -332,6 +394,15 @@
           <w:lang w:val="uk-UA"/>
         </w:rPr>
         <w:t xml:space="preserve">Далі в таблиці я розписав які команди будуть в цьому процесорі.</w:t>
+      </w:r>
+      <w:r>
+        <w:rPr>
+          <w:sz w:val="28"/>
+          <w:szCs w:val="28"/>
+          <w:highlight w:val="none"/>
+          <w:lang w:val="uk-UA"/>
+          <w14:ligatures w14:val="none"/>
+        </w:rPr>
       </w:r>
       <w:r>
         <w:rPr>
@@ -390,7 +461,6 @@
                 <w:sz w:val="24"/>
                 <w:szCs w:val="24"/>
                 <w:highlight w:val="none"/>
-                <w:lang w:val="uk-UA"/>
               </w:rPr>
             </w:r>
             <w:r>
@@ -433,7 +503,6 @@
                 <w:sz w:val="24"/>
                 <w:szCs w:val="24"/>
                 <w:highlight w:val="none"/>
-                <w:lang w:val="uk-UA"/>
               </w:rPr>
             </w:r>
             <w:r>
@@ -476,7 +545,6 @@
                 <w:sz w:val="24"/>
                 <w:szCs w:val="24"/>
                 <w:highlight w:val="none"/>
-                <w:lang w:val="uk-UA"/>
               </w:rPr>
             </w:r>
             <w:r>
@@ -519,7 +587,6 @@
                 <w:sz w:val="24"/>
                 <w:szCs w:val="24"/>
                 <w:highlight w:val="none"/>
-                <w:lang w:val="uk-UA"/>
               </w:rPr>
             </w:r>
             <w:r>
@@ -565,7 +632,6 @@
                 <w:sz w:val="24"/>
                 <w:szCs w:val="24"/>
                 <w:highlight w:val="none"/>
-                <w:lang w:val="uk-UA"/>
               </w:rPr>
             </w:r>
             <w:r>
@@ -614,15 +680,6 @@
                 <w:sz w:val="24"/>
                 <w:szCs w:val="24"/>
                 <w:highlight w:val="none"/>
-                <w:lang w:val="uk-UA" w:bidi="uk-UA"/>
-              </w:rPr>
-            </w:r>
-            <w:r>
-              <w:rPr>
-                <w:sz w:val="24"/>
-                <w:szCs w:val="24"/>
-                <w:highlight w:val="none"/>
-                <w:lang w:val="uk-UA"/>
               </w:rPr>
             </w:r>
             <w:r>
@@ -673,6 +730,13 @@
                 <w:highlight w:val="none"/>
               </w:rPr>
             </w:r>
+            <w:r>
+              <w:rPr>
+                <w:sz w:val="24"/>
+                <w:szCs w:val="24"/>
+                <w:highlight w:val="none"/>
+              </w:rPr>
+            </w:r>
           </w:p>
           <w:p>
             <w:pPr>
@@ -693,6 +757,13 @@
                 <w:highlight w:val="none"/>
               </w:rPr>
               <w:t xml:space="preserve">(00000000)</w:t>
+            </w:r>
+            <w:r>
+              <w:rPr>
+                <w:sz w:val="24"/>
+                <w:szCs w:val="24"/>
+                <w:highlight w:val="none"/>
+              </w:rPr>
             </w:r>
             <w:r>
               <w:rPr>
@@ -734,7 +805,6 @@
                 <w:sz w:val="24"/>
                 <w:szCs w:val="24"/>
                 <w:highlight w:val="none"/>
-                <w:lang w:val="uk-UA"/>
               </w:rPr>
             </w:r>
             <w:r>
@@ -780,7 +850,6 @@
                 <w:sz w:val="24"/>
                 <w:szCs w:val="24"/>
                 <w:highlight w:val="none"/>
-                <w:lang w:val="uk-UA"/>
               </w:rPr>
             </w:r>
             <w:r>
@@ -829,15 +898,6 @@
                 <w:sz w:val="24"/>
                 <w:szCs w:val="24"/>
                 <w:highlight w:val="none"/>
-                <w:lang w:val="uk-UA" w:bidi="uk-UA"/>
-              </w:rPr>
-            </w:r>
-            <w:r>
-              <w:rPr>
-                <w:sz w:val="24"/>
-                <w:szCs w:val="24"/>
-                <w:highlight w:val="none"/>
-                <w:lang w:val="uk-UA"/>
               </w:rPr>
             </w:r>
             <w:r>
@@ -904,6 +964,13 @@
                 <w:highlight w:val="none"/>
               </w:rPr>
             </w:r>
+            <w:r>
+              <w:rPr>
+                <w:sz w:val="24"/>
+                <w:szCs w:val="24"/>
+                <w:highlight w:val="none"/>
+              </w:rPr>
+            </w:r>
           </w:p>
           <w:p>
             <w:pPr>
@@ -933,6 +1000,13 @@
                 <w:highlight w:val="none"/>
               </w:rPr>
             </w:r>
+            <w:r>
+              <w:rPr>
+                <w:sz w:val="24"/>
+                <w:szCs w:val="24"/>
+                <w:highlight w:val="none"/>
+              </w:rPr>
+            </w:r>
           </w:p>
           <w:p>
             <w:pPr>
@@ -959,14 +1033,13 @@
               <w:rPr>
                 <w:sz w:val="24"/>
                 <w:szCs w:val="24"/>
-                <w:highlight w:val="none"/>
-                <w:lang w:val="en-US"/>
-              </w:rPr>
-            </w:r>
-            <w:r>
-              <w:rPr>
-                <w:sz w:val="24"/>
-                <w:szCs w:val="24"/>
+              </w:rPr>
+            </w:r>
+            <w:r>
+              <w:rPr>
+                <w:sz w:val="24"/>
+                <w:szCs w:val="24"/>
+                <w:highlight w:val="none"/>
               </w:rPr>
             </w:r>
           </w:p>
@@ -1020,8 +1093,18 @@
                 <w:sz w:val="24"/>
                 <w:szCs w:val="24"/>
                 <w:highlight w:val="none"/>
+                <w:lang w:val="en-US"/>
+              </w:rPr>
+              <w:t xml:space="preserve">SRAM</w:t>
+            </w:r>
+            <w:r>
+              <w:rPr>
+                <w:sz w:val="24"/>
+                <w:szCs w:val="24"/>
+                <w:highlight w:val="none"/>
                 <w:lang w:val="uk-UA"/>
               </w:rPr>
+              <w:t xml:space="preserve"> позначається </w:t>
             </w:r>
             <w:r>
               <w:rPr>
@@ -1030,6 +1113,24 @@
                 <w:highlight w:val="none"/>
                 <w:lang w:val="en-US"/>
               </w:rPr>
+              <w:t xml:space="preserve">[Rn], n </w:t>
+            </w:r>
+            <w:r>
+              <w:rPr>
+                <w:sz w:val="24"/>
+                <w:szCs w:val="24"/>
+                <w:highlight w:val="none"/>
+                <w:lang w:val="uk-UA"/>
+              </w:rPr>
+              <w:t xml:space="preserve">– це номер регістра. Так як з 8 біт інструкції 4 займає інструкція а 2 номер регістра то залишається ще 2 біти, але так як це дуже мало для памʼяті то номер регістра </w:t>
+            </w:r>
+            <w:r>
+              <w:rPr>
+                <w:sz w:val="24"/>
+                <w:szCs w:val="24"/>
+                <w:highlight w:val="none"/>
+                <w:lang w:val="en-US"/>
+              </w:rPr>
               <w:t xml:space="preserve">SRAM</w:t>
             </w:r>
             <w:r>
@@ -1039,7 +1140,16 @@
                 <w:highlight w:val="none"/>
                 <w:lang w:val="uk-UA"/>
               </w:rPr>
-              <w:t xml:space="preserve"> позначається </w:t>
+              <w:t xml:space="preserve"> </w:t>
+            </w:r>
+            <w:r>
+              <w:rPr>
+                <w:sz w:val="24"/>
+                <w:szCs w:val="24"/>
+                <w:highlight w:val="none"/>
+                <w:lang w:val="uk-UA"/>
+              </w:rPr>
+              <w:t xml:space="preserve">буде передаватись наступною інструкцією 8 біт, тобто всього доступно 256 регістрів </w:t>
             </w:r>
             <w:r>
               <w:rPr>
@@ -1048,57 +1158,12 @@
                 <w:highlight w:val="none"/>
                 <w:lang w:val="en-US"/>
               </w:rPr>
-              <w:t xml:space="preserve">[Rn], n </w:t>
-            </w:r>
-            <w:r>
-              <w:rPr>
-                <w:sz w:val="24"/>
-                <w:szCs w:val="24"/>
-                <w:highlight w:val="none"/>
+              <w:t xml:space="preserve">SRAM</w:t>
+            </w:r>
+            <w:r>
+              <w:rPr>
                 <w:lang w:val="uk-UA"/>
               </w:rPr>
-              <w:t xml:space="preserve">– це номер регістра. Так як з 8 біт інструкції 4 займає інструкція а 2 номер регістра то залишається ще 2 біти, але так як це дуже мало для памʼяті то номер регістра </w:t>
-            </w:r>
-            <w:r>
-              <w:rPr>
-                <w:sz w:val="24"/>
-                <w:szCs w:val="24"/>
-                <w:highlight w:val="none"/>
-                <w:lang w:val="en-US"/>
-              </w:rPr>
-              <w:t xml:space="preserve">SRAM</w:t>
-            </w:r>
-            <w:r>
-              <w:rPr>
-                <w:sz w:val="24"/>
-                <w:szCs w:val="24"/>
-                <w:highlight w:val="none"/>
-                <w:lang w:val="uk-UA"/>
-              </w:rPr>
-              <w:t xml:space="preserve"> </w:t>
-            </w:r>
-            <w:r>
-              <w:rPr>
-                <w:sz w:val="24"/>
-                <w:szCs w:val="24"/>
-                <w:highlight w:val="none"/>
-                <w:lang w:val="uk-UA"/>
-              </w:rPr>
-              <w:t xml:space="preserve">буде передаватись наступною інструкцією 8 біт, тобто всього доступно 256 регістрів </w:t>
-            </w:r>
-            <w:r>
-              <w:rPr>
-                <w:sz w:val="24"/>
-                <w:szCs w:val="24"/>
-                <w:highlight w:val="none"/>
-                <w:lang w:val="en-US"/>
-              </w:rPr>
-              <w:t xml:space="preserve">SRAM</w:t>
-            </w:r>
-            <w:r>
-              <w:rPr>
-                <w:lang w:val="uk-UA"/>
-              </w:rPr>
               <w:t xml:space="preserve">.</w:t>
             </w:r>
             <w:r>
@@ -1106,7 +1171,6 @@
                 <w:sz w:val="24"/>
                 <w:szCs w:val="24"/>
                 <w:highlight w:val="none"/>
-                <w:lang w:val="uk-UA"/>
               </w:rPr>
             </w:r>
             <w:r>
@@ -1152,7 +1216,6 @@
                 <w:sz w:val="24"/>
                 <w:szCs w:val="24"/>
                 <w:highlight w:val="none"/>
-                <w:lang w:val="uk-UA"/>
               </w:rPr>
             </w:r>
             <w:r>
@@ -1201,15 +1264,6 @@
                 <w:sz w:val="24"/>
                 <w:szCs w:val="24"/>
                 <w:highlight w:val="none"/>
-                <w:lang w:val="uk-UA" w:bidi="uk-UA"/>
-              </w:rPr>
-            </w:r>
-            <w:r>
-              <w:rPr>
-                <w:sz w:val="24"/>
-                <w:szCs w:val="24"/>
-                <w:highlight w:val="none"/>
-                <w:lang w:val="uk-UA"/>
               </w:rPr>
             </w:r>
             <w:r>
@@ -1269,13 +1323,36 @@
               </w:rPr>
               <w:t xml:space="preserve">[R4] R2</w:t>
               <w:br/>
-              <w:t xml:space="preserve">(00101000</w:t>
-            </w:r>
-            <w:r>
-              <w:rPr>
-                <w:sz w:val="24"/>
-                <w:szCs w:val="24"/>
-                <w:highlight w:val="none"/>
+              <w:t xml:space="preserve">(001000</w:t>
+            </w:r>
+            <w:r>
+              <w:rPr>
+                <w:sz w:val="24"/>
+                <w:szCs w:val="24"/>
+                <w:lang w:val="en-US"/>
+              </w:rPr>
+              <w:t xml:space="preserve">10</w:t>
+            </w:r>
+            <w:r/>
+            <w:r>
+              <w:rPr>
+                <w:sz w:val="24"/>
+                <w:szCs w:val="24"/>
+                <w:lang w:val="en-US"/>
+              </w:rPr>
+            </w:r>
+            <w:r>
+              <w:rPr>
+                <w:sz w:val="24"/>
+                <w:szCs w:val="24"/>
+                <w:highlight w:val="none"/>
+              </w:rPr>
+            </w:r>
+            <w:r>
+              <w:rPr>
+                <w:sz w:val="24"/>
+                <w:szCs w:val="24"/>
+                <w:lang w:val="en-US"/>
               </w:rPr>
             </w:r>
           </w:p>
@@ -1306,7 +1383,13 @@
                 <w:highlight w:val="none"/>
               </w:rPr>
             </w:r>
-            <w:r/>
+            <w:r>
+              <w:rPr>
+                <w:sz w:val="24"/>
+                <w:szCs w:val="24"/>
+                <w:highlight w:val="none"/>
+              </w:rPr>
+            </w:r>
           </w:p>
         </w:tc>
         <w:tc>
@@ -1379,7 +1462,6 @@
                 <w:sz w:val="24"/>
                 <w:szCs w:val="24"/>
                 <w:highlight w:val="none"/>
-                <w:lang w:val="uk-UA"/>
               </w:rPr>
             </w:r>
             <w:r>
@@ -1425,7 +1507,6 @@
                 <w:sz w:val="24"/>
                 <w:szCs w:val="24"/>
                 <w:highlight w:val="none"/>
-                <w:lang w:val="uk-UA"/>
               </w:rPr>
             </w:r>
             <w:r>
@@ -1474,15 +1555,6 @@
                 <w:sz w:val="24"/>
                 <w:szCs w:val="24"/>
                 <w:highlight w:val="none"/>
-                <w:lang w:val="uk-UA" w:bidi="uk-UA"/>
-              </w:rPr>
-            </w:r>
-            <w:r>
-              <w:rPr>
-                <w:sz w:val="24"/>
-                <w:szCs w:val="24"/>
-                <w:highlight w:val="none"/>
-                <w:lang w:val="uk-UA"/>
               </w:rPr>
             </w:r>
             <w:r>
@@ -1551,6 +1623,14 @@
                 <w:highlight w:val="none"/>
               </w:rPr>
             </w:r>
+            <w:r>
+              <w:rPr>
+                <w:sz w:val="24"/>
+                <w:szCs w:val="24"/>
+                <w:highlight w:val="none"/>
+                <w:lang w:val="en-US"/>
+              </w:rPr>
+            </w:r>
           </w:p>
           <w:p>
             <w:pPr>
@@ -1586,7 +1666,6 @@
                 <w:sz w:val="24"/>
                 <w:szCs w:val="24"/>
                 <w:highlight w:val="none"/>
-                <w:lang w:val="en-US"/>
               </w:rPr>
             </w:r>
           </w:p>
@@ -1616,6 +1695,13 @@
                 <w:lang w:val="uk-UA"/>
               </w:rPr>
               <w:t xml:space="preserve">Команда що просто додає два 4-бітних числа з регістрів.</w:t>
+            </w:r>
+            <w:r>
+              <w:rPr>
+                <w:sz w:val="24"/>
+                <w:szCs w:val="24"/>
+                <w:highlight w:val="none"/>
+              </w:rPr>
             </w:r>
             <w:r>
               <w:rPr>
@@ -1660,7 +1746,6 @@
                 <w:sz w:val="24"/>
                 <w:szCs w:val="24"/>
                 <w:highlight w:val="none"/>
-                <w:lang w:val="uk-UA"/>
               </w:rPr>
             </w:r>
             <w:r>
@@ -1709,15 +1794,6 @@
                 <w:sz w:val="24"/>
                 <w:szCs w:val="24"/>
                 <w:highlight w:val="none"/>
-                <w:lang w:val="uk-UA" w:bidi="uk-UA"/>
-              </w:rPr>
-            </w:r>
-            <w:r>
-              <w:rPr>
-                <w:sz w:val="24"/>
-                <w:szCs w:val="24"/>
-                <w:highlight w:val="none"/>
-                <w:lang w:val="uk-UA"/>
               </w:rPr>
             </w:r>
             <w:r>
@@ -1834,36 +1910,6 @@
                 <w:lang w:val="en-US"/>
               </w:rPr>
               <w:t xml:space="preserve">0001)</w:t>
-            </w:r>
-            <w:r>
-              <w:rPr>
-                <w:sz w:val="24"/>
-                <w:szCs w:val="24"/>
-                <w:highlight w:val="none"/>
-              </w:rPr>
-            </w:r>
-            <w:r>
-              <w:rPr>
-                <w:sz w:val="24"/>
-                <w:szCs w:val="24"/>
-                <w:highlight w:val="none"/>
-              </w:rPr>
-            </w:r>
-            <w:r>
-              <w:rPr>
-                <w:sz w:val="24"/>
-                <w:szCs w:val="24"/>
-                <w:highlight w:val="none"/>
-                <w:lang w:val="uk-UA" w:bidi="uk-UA"/>
-              </w:rPr>
-            </w:r>
-            <w:r>
-              <w:rPr>
-                <w:sz w:val="24"/>
-                <w:szCs w:val="24"/>
-                <w:highlight w:val="none"/>
-                <w:lang w:val="uk-UA"/>
-              </w:rPr>
             </w:r>
             <w:r>
               <w:rPr>
@@ -1957,7 +2003,6 @@
                 <w:sz w:val="24"/>
                 <w:szCs w:val="24"/>
                 <w:highlight w:val="none"/>
-                <w:lang w:val="uk-UA"/>
               </w:rPr>
             </w:r>
             <w:r>
@@ -2006,15 +2051,6 @@
                 <w:sz w:val="24"/>
                 <w:szCs w:val="24"/>
                 <w:highlight w:val="none"/>
-                <w:lang w:val="uk-UA" w:bidi="uk-UA"/>
-              </w:rPr>
-            </w:r>
-            <w:r>
-              <w:rPr>
-                <w:sz w:val="24"/>
-                <w:szCs w:val="24"/>
-                <w:highlight w:val="none"/>
-                <w:lang w:val="uk-UA"/>
               </w:rPr>
             </w:r>
             <w:r>
@@ -2072,18 +2108,18 @@
                 <w:sz w:val="24"/>
                 <w:szCs w:val="24"/>
                 <w:highlight w:val="none"/>
-              </w:rPr>
-            </w:r>
-            <w:r>
-              <w:rPr>
-                <w:sz w:val="24"/>
-                <w:szCs w:val="24"/>
-                <w:highlight w:val="none"/>
                 <w:lang w:val="en-US"/>
               </w:rPr>
               <w:t xml:space="preserve">R0 R1</w:t>
             </w:r>
-            <w:r/>
+            <w:r>
+              <w:rPr>
+                <w:sz w:val="24"/>
+                <w:szCs w:val="24"/>
+                <w:highlight w:val="none"/>
+                <w:lang w:val="en-US"/>
+              </w:rPr>
+            </w:r>
             <w:r>
               <w:rPr>
                 <w:sz w:val="24"/>
@@ -2139,28 +2175,6 @@
                 <w:highlight w:val="none"/>
               </w:rPr>
             </w:r>
-            <w:r>
-              <w:rPr>
-                <w:sz w:val="24"/>
-                <w:szCs w:val="24"/>
-                <w:highlight w:val="none"/>
-              </w:rPr>
-            </w:r>
-            <w:r>
-              <w:rPr>
-                <w:sz w:val="24"/>
-                <w:szCs w:val="24"/>
-                <w:lang w:val="uk-UA"/>
-              </w:rPr>
-            </w:r>
-            <w:r>
-              <w:rPr>
-                <w:sz w:val="24"/>
-                <w:szCs w:val="24"/>
-                <w:highlight w:val="none"/>
-              </w:rPr>
-            </w:r>
-            <w:r/>
             <w:r>
               <w:rPr>
                 <w:sz w:val="24"/>
@@ -2201,7 +2215,6 @@
                 <w:sz w:val="24"/>
                 <w:szCs w:val="24"/>
                 <w:highlight w:val="none"/>
-                <w:lang w:val="uk-UA"/>
               </w:rPr>
             </w:r>
             <w:r>
@@ -2247,7 +2260,6 @@
                 <w:sz w:val="24"/>
                 <w:szCs w:val="24"/>
                 <w:highlight w:val="none"/>
-                <w:lang w:val="uk-UA"/>
               </w:rPr>
             </w:r>
             <w:r>
@@ -2296,15 +2308,6 @@
                 <w:sz w:val="24"/>
                 <w:szCs w:val="24"/>
                 <w:highlight w:val="none"/>
-                <w:lang w:val="uk-UA" w:bidi="uk-UA"/>
-              </w:rPr>
-            </w:r>
-            <w:r>
-              <w:rPr>
-                <w:sz w:val="24"/>
-                <w:szCs w:val="24"/>
-                <w:highlight w:val="none"/>
-                <w:lang w:val="uk-UA"/>
               </w:rPr>
             </w:r>
             <w:r>
@@ -2361,34 +2364,6 @@
                 <w:sz w:val="24"/>
                 <w:szCs w:val="24"/>
                 <w:highlight w:val="none"/>
-              </w:rPr>
-            </w:r>
-            <w:r>
-              <w:rPr>
-                <w:sz w:val="24"/>
-                <w:szCs w:val="24"/>
-                <w:highlight w:val="none"/>
-              </w:rPr>
-            </w:r>
-            <w:r>
-              <w:rPr>
-                <w:sz w:val="24"/>
-                <w:szCs w:val="24"/>
-                <w:highlight w:val="none"/>
-                <w:lang w:val="uk-UA" w:bidi="uk-UA"/>
-              </w:rPr>
-            </w:r>
-            <w:r>
-              <w:rPr>
-                <w:sz w:val="24"/>
-                <w:szCs w:val="24"/>
-              </w:rPr>
-            </w:r>
-            <w:r>
-              <w:rPr>
-                <w:sz w:val="24"/>
-                <w:szCs w:val="24"/>
-                <w:highlight w:val="none"/>
                 <w:lang w:val="en-US"/>
               </w:rPr>
               <w:t xml:space="preserve">R0 R1</w:t>
@@ -2398,15 +2373,6 @@
                 <w:sz w:val="24"/>
                 <w:szCs w:val="24"/>
                 <w:highlight w:val="none"/>
-                <w:lang w:val="en-US"/>
-              </w:rPr>
-            </w:r>
-            <w:r>
-              <w:rPr>
-                <w:sz w:val="24"/>
-                <w:szCs w:val="24"/>
-                <w:highlight w:val="none"/>
-                <w:lang w:val="en-US"/>
               </w:rPr>
             </w:r>
             <w:r>
@@ -2455,36 +2421,6 @@
                 <w:lang w:val="en-US"/>
               </w:rPr>
               <w:t xml:space="preserve">0001)</w:t>
-            </w:r>
-            <w:r>
-              <w:rPr>
-                <w:sz w:val="24"/>
-                <w:szCs w:val="24"/>
-                <w:highlight w:val="none"/>
-              </w:rPr>
-            </w:r>
-            <w:r>
-              <w:rPr>
-                <w:sz w:val="24"/>
-                <w:szCs w:val="24"/>
-                <w:highlight w:val="none"/>
-              </w:rPr>
-            </w:r>
-            <w:r>
-              <w:rPr>
-                <w:sz w:val="24"/>
-                <w:szCs w:val="24"/>
-                <w:highlight w:val="none"/>
-                <w:lang w:val="uk-UA" w:bidi="uk-UA"/>
-              </w:rPr>
-            </w:r>
-            <w:r>
-              <w:rPr>
-                <w:sz w:val="24"/>
-                <w:szCs w:val="24"/>
-                <w:highlight w:val="none"/>
-                <w:lang w:val="uk-UA"/>
-              </w:rPr>
             </w:r>
             <w:r>
               <w:rPr>
@@ -2532,21 +2468,6 @@
               <w:rPr>
                 <w:sz w:val="24"/>
                 <w:szCs w:val="24"/>
-                <w:highlight w:val="none"/>
-              </w:rPr>
-            </w:r>
-            <w:r>
-              <w:rPr>
-                <w:sz w:val="24"/>
-                <w:szCs w:val="24"/>
-                <w:highlight w:val="none"/>
-                <w:lang w:val="uk-UA" w:bidi="uk-UA"/>
-              </w:rPr>
-            </w:r>
-            <w:r>
-              <w:rPr>
-                <w:sz w:val="24"/>
-                <w:szCs w:val="24"/>
               </w:rPr>
               <w:t xml:space="preserve">AND</w:t>
             </w:r>
@@ -2558,7 +2479,13 @@
               </w:rPr>
               <w:t xml:space="preserve"> над числами в регістрах 0 та 1.</w:t>
             </w:r>
-            <w:r/>
+            <w:r>
+              <w:rPr>
+                <w:sz w:val="24"/>
+                <w:szCs w:val="24"/>
+                <w:highlight w:val="none"/>
+              </w:rPr>
+            </w:r>
             <w:r>
               <w:rPr>
                 <w:sz w:val="24"/>
@@ -2602,7 +2529,6 @@
                 <w:sz w:val="24"/>
                 <w:szCs w:val="24"/>
                 <w:highlight w:val="none"/>
-                <w:lang w:val="uk-UA"/>
               </w:rPr>
             </w:r>
             <w:r>
@@ -2651,15 +2577,6 @@
                 <w:sz w:val="24"/>
                 <w:szCs w:val="24"/>
                 <w:highlight w:val="none"/>
-                <w:lang w:val="uk-UA" w:bidi="uk-UA"/>
-              </w:rPr>
-            </w:r>
-            <w:r>
-              <w:rPr>
-                <w:sz w:val="24"/>
-                <w:szCs w:val="24"/>
-                <w:highlight w:val="none"/>
-                <w:lang w:val="uk-UA"/>
               </w:rPr>
             </w:r>
             <w:r>
@@ -2716,44 +2633,9 @@
                 <w:sz w:val="24"/>
                 <w:szCs w:val="24"/>
                 <w:highlight w:val="none"/>
-              </w:rPr>
-            </w:r>
-            <w:r>
-              <w:rPr>
-                <w:sz w:val="24"/>
-                <w:szCs w:val="24"/>
-                <w:highlight w:val="none"/>
-              </w:rPr>
-            </w:r>
-            <w:r>
-              <w:rPr>
-                <w:sz w:val="24"/>
-                <w:szCs w:val="24"/>
-                <w:highlight w:val="none"/>
-                <w:lang w:val="uk-UA" w:bidi="uk-UA"/>
-              </w:rPr>
-            </w:r>
-            <w:r>
-              <w:rPr>
-                <w:sz w:val="24"/>
-                <w:szCs w:val="24"/>
-              </w:rPr>
-            </w:r>
-            <w:r>
-              <w:rPr>
-                <w:sz w:val="24"/>
-                <w:szCs w:val="24"/>
-                <w:highlight w:val="none"/>
                 <w:lang w:val="en-US"/>
               </w:rPr>
               <w:t xml:space="preserve">R0 R1</w:t>
-            </w:r>
-            <w:r>
-              <w:rPr>
-                <w:sz w:val="24"/>
-                <w:szCs w:val="24"/>
-                <w:highlight w:val="none"/>
-              </w:rPr>
             </w:r>
             <w:r>
               <w:rPr>
@@ -2855,21 +2737,6 @@
               <w:rPr>
                 <w:sz w:val="24"/>
                 <w:szCs w:val="24"/>
-                <w:highlight w:val="none"/>
-              </w:rPr>
-            </w:r>
-            <w:r>
-              <w:rPr>
-                <w:sz w:val="24"/>
-                <w:szCs w:val="24"/>
-                <w:highlight w:val="none"/>
-                <w:lang w:val="uk-UA" w:bidi="uk-UA"/>
-              </w:rPr>
-            </w:r>
-            <w:r>
-              <w:rPr>
-                <w:sz w:val="24"/>
-                <w:szCs w:val="24"/>
               </w:rPr>
               <w:t xml:space="preserve">OR</w:t>
             </w:r>
@@ -2885,28 +2752,6 @@
               <w:rPr>
                 <w:sz w:val="24"/>
                 <w:szCs w:val="24"/>
-                <w:highlight w:val="none"/>
-              </w:rPr>
-            </w:r>
-            <w:r>
-              <w:rPr>
-                <w:sz w:val="24"/>
-                <w:szCs w:val="24"/>
-                <w:highlight w:val="none"/>
-              </w:rPr>
-            </w:r>
-            <w:r>
-              <w:rPr>
-                <w:sz w:val="24"/>
-                <w:szCs w:val="24"/>
-                <w:highlight w:val="none"/>
-                <w:lang w:val="uk-UA" w:bidi="uk-UA"/>
-              </w:rPr>
-            </w:r>
-            <w:r>
-              <w:rPr>
-                <w:sz w:val="24"/>
-                <w:szCs w:val="24"/>
                 <w:lang w:val="uk-UA"/>
               </w:rPr>
               <w:t xml:space="preserve">над числами в регістрах 0 та 1.</w:t>
@@ -2918,7 +2763,6 @@
                 <w:highlight w:val="none"/>
               </w:rPr>
             </w:r>
-            <w:r/>
             <w:r>
               <w:rPr>
                 <w:sz w:val="24"/>
@@ -2962,7 +2806,6 @@
                 <w:sz w:val="24"/>
                 <w:szCs w:val="24"/>
                 <w:highlight w:val="none"/>
-                <w:lang w:val="uk-UA"/>
               </w:rPr>
             </w:r>
             <w:r>
@@ -3011,15 +2854,6 @@
                 <w:sz w:val="24"/>
                 <w:szCs w:val="24"/>
                 <w:highlight w:val="none"/>
-                <w:lang w:val="uk-UA" w:bidi="uk-UA"/>
-              </w:rPr>
-            </w:r>
-            <w:r>
-              <w:rPr>
-                <w:sz w:val="24"/>
-                <w:szCs w:val="24"/>
-                <w:highlight w:val="none"/>
-                <w:lang w:val="uk-UA"/>
               </w:rPr>
             </w:r>
             <w:r>
@@ -3076,44 +2910,9 @@
                 <w:sz w:val="24"/>
                 <w:szCs w:val="24"/>
                 <w:highlight w:val="none"/>
-              </w:rPr>
-            </w:r>
-            <w:r>
-              <w:rPr>
-                <w:sz w:val="24"/>
-                <w:szCs w:val="24"/>
-                <w:highlight w:val="none"/>
-              </w:rPr>
-            </w:r>
-            <w:r>
-              <w:rPr>
-                <w:sz w:val="24"/>
-                <w:szCs w:val="24"/>
-                <w:highlight w:val="none"/>
-                <w:lang w:val="uk-UA" w:bidi="uk-UA"/>
-              </w:rPr>
-            </w:r>
-            <w:r>
-              <w:rPr>
-                <w:sz w:val="24"/>
-                <w:szCs w:val="24"/>
-              </w:rPr>
-            </w:r>
-            <w:r>
-              <w:rPr>
-                <w:sz w:val="24"/>
-                <w:szCs w:val="24"/>
-                <w:highlight w:val="none"/>
                 <w:lang w:val="en-US"/>
               </w:rPr>
               <w:t xml:space="preserve">R0 R1</w:t>
-            </w:r>
-            <w:r>
-              <w:rPr>
-                <w:sz w:val="24"/>
-                <w:szCs w:val="24"/>
-                <w:highlight w:val="none"/>
-              </w:rPr>
             </w:r>
             <w:r>
               <w:rPr>
@@ -3218,21 +3017,6 @@
               <w:rPr>
                 <w:sz w:val="24"/>
                 <w:szCs w:val="24"/>
-                <w:highlight w:val="none"/>
-              </w:rPr>
-            </w:r>
-            <w:r>
-              <w:rPr>
-                <w:sz w:val="24"/>
-                <w:szCs w:val="24"/>
-                <w:highlight w:val="none"/>
-                <w:lang w:val="uk-UA" w:bidi="uk-UA"/>
-              </w:rPr>
-            </w:r>
-            <w:r>
-              <w:rPr>
-                <w:sz w:val="24"/>
-                <w:szCs w:val="24"/>
               </w:rPr>
               <w:t xml:space="preserve">XOR</w:t>
             </w:r>
@@ -3248,28 +3032,6 @@
               <w:rPr>
                 <w:sz w:val="24"/>
                 <w:szCs w:val="24"/>
-                <w:highlight w:val="none"/>
-              </w:rPr>
-            </w:r>
-            <w:r>
-              <w:rPr>
-                <w:sz w:val="24"/>
-                <w:szCs w:val="24"/>
-                <w:highlight w:val="none"/>
-              </w:rPr>
-            </w:r>
-            <w:r>
-              <w:rPr>
-                <w:sz w:val="24"/>
-                <w:szCs w:val="24"/>
-                <w:highlight w:val="none"/>
-                <w:lang w:val="uk-UA" w:bidi="uk-UA"/>
-              </w:rPr>
-            </w:r>
-            <w:r>
-              <w:rPr>
-                <w:sz w:val="24"/>
-                <w:szCs w:val="24"/>
                 <w:lang w:val="uk-UA"/>
               </w:rPr>
               <w:t xml:space="preserve">над числами в регістрах 0 та 1.</w:t>
@@ -3281,7 +3043,6 @@
                 <w:highlight w:val="none"/>
               </w:rPr>
             </w:r>
-            <w:r/>
             <w:r>
               <w:rPr>
                 <w:sz w:val="24"/>
@@ -3325,7 +3086,6 @@
                 <w:sz w:val="24"/>
                 <w:szCs w:val="24"/>
                 <w:highlight w:val="none"/>
-                <w:lang w:val="uk-UA"/>
               </w:rPr>
             </w:r>
             <w:r>
@@ -3374,15 +3134,6 @@
                 <w:sz w:val="24"/>
                 <w:szCs w:val="24"/>
                 <w:highlight w:val="none"/>
-                <w:lang w:val="uk-UA" w:bidi="uk-UA"/>
-              </w:rPr>
-            </w:r>
-            <w:r>
-              <w:rPr>
-                <w:sz w:val="24"/>
-                <w:szCs w:val="24"/>
-                <w:highlight w:val="none"/>
-                <w:lang w:val="uk-UA"/>
               </w:rPr>
             </w:r>
             <w:r>
@@ -3439,34 +3190,6 @@
                 <w:sz w:val="24"/>
                 <w:szCs w:val="24"/>
                 <w:highlight w:val="none"/>
-              </w:rPr>
-            </w:r>
-            <w:r>
-              <w:rPr>
-                <w:sz w:val="24"/>
-                <w:szCs w:val="24"/>
-                <w:highlight w:val="none"/>
-              </w:rPr>
-            </w:r>
-            <w:r>
-              <w:rPr>
-                <w:sz w:val="24"/>
-                <w:szCs w:val="24"/>
-                <w:highlight w:val="none"/>
-                <w:lang w:val="uk-UA" w:bidi="uk-UA"/>
-              </w:rPr>
-            </w:r>
-            <w:r>
-              <w:rPr>
-                <w:sz w:val="24"/>
-                <w:szCs w:val="24"/>
-              </w:rPr>
-            </w:r>
-            <w:r>
-              <w:rPr>
-                <w:sz w:val="24"/>
-                <w:szCs w:val="24"/>
-                <w:highlight w:val="none"/>
                 <w:lang w:val="en-US"/>
               </w:rPr>
               <w:t xml:space="preserve">R0 </w:t>
@@ -3488,6 +3211,13 @@
                 <w:lang w:val="en-US"/>
               </w:rPr>
               <w:t xml:space="preserve">/0</w:t>
+            </w:r>
+            <w:r>
+              <w:rPr>
+                <w:sz w:val="24"/>
+                <w:szCs w:val="24"/>
+                <w:highlight w:val="none"/>
+              </w:rPr>
             </w:r>
             <w:r>
               <w:rPr>
@@ -3579,7 +3309,6 @@
                 <w:sz w:val="24"/>
                 <w:szCs w:val="24"/>
                 <w:highlight w:val="none"/>
-                <w:lang w:val="uk-UA"/>
               </w:rPr>
             </w:r>
             <w:r>
@@ -3616,6 +3345,13 @@
                 <w:lang w:val="uk-UA"/>
               </w:rPr>
               <w:t xml:space="preserve">Команда що в залежності від числа в кінці інструкції додає або віднімає 1 від числа в вказаному регістрі і зберігає в той самий регістр.</w:t>
+            </w:r>
+            <w:r>
+              <w:rPr>
+                <w:sz w:val="24"/>
+                <w:szCs w:val="24"/>
+                <w:highlight w:val="none"/>
+              </w:rPr>
             </w:r>
             <w:r>
               <w:rPr>
@@ -3660,7 +3396,6 @@
                 <w:sz w:val="24"/>
                 <w:szCs w:val="24"/>
                 <w:highlight w:val="none"/>
-                <w:lang w:val="uk-UA"/>
               </w:rPr>
             </w:r>
             <w:r>
@@ -3709,15 +3444,6 @@
                 <w:sz w:val="24"/>
                 <w:szCs w:val="24"/>
                 <w:highlight w:val="none"/>
-                <w:lang w:val="uk-UA" w:bidi="uk-UA"/>
-              </w:rPr>
-            </w:r>
-            <w:r>
-              <w:rPr>
-                <w:sz w:val="24"/>
-                <w:szCs w:val="24"/>
-                <w:highlight w:val="none"/>
-                <w:lang w:val="uk-UA"/>
               </w:rPr>
             </w:r>
             <w:r>
@@ -3774,26 +3500,6 @@
                 <w:sz w:val="24"/>
                 <w:szCs w:val="24"/>
                 <w:highlight w:val="none"/>
-              </w:rPr>
-            </w:r>
-            <w:r>
-              <w:rPr>
-                <w:sz w:val="24"/>
-                <w:szCs w:val="24"/>
-                <w:highlight w:val="none"/>
-              </w:rPr>
-            </w:r>
-            <w:r>
-              <w:rPr>
-                <w:sz w:val="24"/>
-                <w:szCs w:val="24"/>
-              </w:rPr>
-            </w:r>
-            <w:r>
-              <w:rPr>
-                <w:sz w:val="24"/>
-                <w:szCs w:val="24"/>
-                <w:highlight w:val="none"/>
                 <w:lang w:val="en-US"/>
               </w:rPr>
               <w:t xml:space="preserve">R0 </w:t>
@@ -3815,13 +3521,6 @@
                 <w:lang w:val="en-US"/>
               </w:rPr>
               <w:t xml:space="preserve">/0</w:t>
-            </w:r>
-            <w:r>
-              <w:rPr>
-                <w:sz w:val="24"/>
-                <w:szCs w:val="24"/>
-                <w:highlight w:val="none"/>
-              </w:rPr>
             </w:r>
             <w:r>
               <w:rPr>
@@ -4007,7 +3706,6 @@
                 <w:sz w:val="24"/>
                 <w:szCs w:val="24"/>
                 <w:highlight w:val="none"/>
-                <w:lang w:val="uk-UA"/>
               </w:rPr>
             </w:r>
             <w:r>
@@ -4056,15 +3754,6 @@
                 <w:sz w:val="24"/>
                 <w:szCs w:val="24"/>
                 <w:highlight w:val="none"/>
-                <w:lang w:val="uk-UA" w:bidi="uk-UA"/>
-              </w:rPr>
-            </w:r>
-            <w:r>
-              <w:rPr>
-                <w:sz w:val="24"/>
-                <w:szCs w:val="24"/>
-                <w:highlight w:val="none"/>
-                <w:lang w:val="uk-UA"/>
               </w:rPr>
             </w:r>
             <w:r>
@@ -4120,34 +3809,6 @@
               <w:rPr>
                 <w:sz w:val="24"/>
                 <w:szCs w:val="24"/>
-                <w:highlight w:val="none"/>
-              </w:rPr>
-            </w:r>
-            <w:r>
-              <w:rPr>
-                <w:sz w:val="24"/>
-                <w:szCs w:val="24"/>
-                <w:highlight w:val="none"/>
-              </w:rPr>
-            </w:r>
-            <w:r>
-              <w:rPr>
-                <w:sz w:val="24"/>
-                <w:szCs w:val="24"/>
-                <w:highlight w:val="none"/>
-                <w:lang w:val="uk-UA" w:bidi="uk-UA"/>
-              </w:rPr>
-            </w:r>
-            <w:r>
-              <w:rPr>
-                <w:sz w:val="24"/>
-                <w:szCs w:val="24"/>
-              </w:rPr>
-            </w:r>
-            <w:r>
-              <w:rPr>
-                <w:sz w:val="24"/>
-                <w:szCs w:val="24"/>
                 <w:lang w:val="en-US"/>
               </w:rPr>
               <w:t xml:space="preserve">R1 </w:t>
@@ -4159,6 +3820,13 @@
                 <w:lang w:val="uk-UA"/>
               </w:rPr>
               <w:t xml:space="preserve">13</w:t>
+            </w:r>
+            <w:r>
+              <w:rPr>
+                <w:sz w:val="24"/>
+                <w:szCs w:val="24"/>
+                <w:highlight w:val="none"/>
+              </w:rPr>
             </w:r>
             <w:r>
               <w:rPr>
@@ -4328,7 +3996,6 @@
                 <w:sz w:val="24"/>
                 <w:szCs w:val="24"/>
                 <w:highlight w:val="none"/>
-                <w:lang w:val="uk-UA"/>
               </w:rPr>
             </w:r>
             <w:r>
@@ -4371,7 +4038,6 @@
                 <w:sz w:val="24"/>
                 <w:szCs w:val="24"/>
                 <w:highlight w:val="none"/>
-                <w:lang w:val="uk-UA"/>
               </w:rPr>
             </w:r>
             <w:r>
@@ -4417,7 +4083,6 @@
                 <w:sz w:val="24"/>
                 <w:szCs w:val="24"/>
                 <w:highlight w:val="none"/>
-                <w:lang w:val="uk-UA"/>
               </w:rPr>
             </w:r>
             <w:r>
@@ -4466,15 +4131,6 @@
                 <w:sz w:val="24"/>
                 <w:szCs w:val="24"/>
                 <w:highlight w:val="none"/>
-                <w:lang w:val="uk-UA" w:bidi="uk-UA"/>
-              </w:rPr>
-            </w:r>
-            <w:r>
-              <w:rPr>
-                <w:sz w:val="24"/>
-                <w:szCs w:val="24"/>
-                <w:highlight w:val="none"/>
-                <w:lang w:val="uk-UA"/>
               </w:rPr>
             </w:r>
             <w:r>
@@ -4531,44 +4187,9 @@
                 <w:sz w:val="24"/>
                 <w:szCs w:val="24"/>
                 <w:highlight w:val="none"/>
-              </w:rPr>
-            </w:r>
-            <w:r>
-              <w:rPr>
-                <w:sz w:val="24"/>
-                <w:szCs w:val="24"/>
-                <w:highlight w:val="none"/>
-              </w:rPr>
-            </w:r>
-            <w:r>
-              <w:rPr>
-                <w:sz w:val="24"/>
-                <w:szCs w:val="24"/>
-                <w:highlight w:val="none"/>
-                <w:lang w:val="uk-UA" w:bidi="uk-UA"/>
-              </w:rPr>
-            </w:r>
-            <w:r>
-              <w:rPr>
-                <w:sz w:val="24"/>
-                <w:szCs w:val="24"/>
-              </w:rPr>
-            </w:r>
-            <w:r>
-              <w:rPr>
-                <w:sz w:val="24"/>
-                <w:szCs w:val="24"/>
-                <w:highlight w:val="none"/>
                 <w:lang w:val="en-US"/>
               </w:rPr>
               <w:t xml:space="preserve">R0 R1</w:t>
-            </w:r>
-            <w:r>
-              <w:rPr>
-                <w:sz w:val="24"/>
-                <w:szCs w:val="24"/>
-                <w:highlight w:val="none"/>
-              </w:rPr>
             </w:r>
             <w:r>
               <w:rPr>
@@ -4724,7 +4345,6 @@
                 <w:sz w:val="24"/>
                 <w:szCs w:val="24"/>
                 <w:highlight w:val="none"/>
-                <w:lang w:val="uk-UA"/>
               </w:rPr>
             </w:r>
             <w:r>
@@ -4773,15 +4393,6 @@
                 <w:sz w:val="24"/>
                 <w:szCs w:val="24"/>
                 <w:highlight w:val="none"/>
-                <w:lang w:val="uk-UA" w:bidi="uk-UA"/>
-              </w:rPr>
-            </w:r>
-            <w:r>
-              <w:rPr>
-                <w:sz w:val="24"/>
-                <w:szCs w:val="24"/>
-                <w:highlight w:val="none"/>
-                <w:lang w:val="uk-UA"/>
               </w:rPr>
             </w:r>
             <w:r>
@@ -4912,6 +4523,13 @@
                 <w:highlight w:val="none"/>
               </w:rPr>
             </w:r>
+            <w:r>
+              <w:rPr>
+                <w:sz w:val="24"/>
+                <w:szCs w:val="24"/>
+                <w:highlight w:val="none"/>
+              </w:rPr>
+            </w:r>
           </w:p>
           <w:p>
             <w:pPr>
@@ -4949,45 +4567,7 @@
                 <w:highlight w:val="none"/>
                 <w:lang w:val="en-US"/>
               </w:rPr>
-            </w:r>
-            <w:r>
-              <w:rPr>
-                <w:sz w:val="24"/>
-                <w:szCs w:val="24"/>
-                <w:highlight w:val="none"/>
-                <w:lang w:val="en-US"/>
-              </w:rPr>
               <w:t xml:space="preserve">)</w:t>
-            </w:r>
-            <w:r>
-              <w:rPr>
-                <w:sz w:val="24"/>
-                <w:szCs w:val="24"/>
-                <w:highlight w:val="none"/>
-              </w:rPr>
-            </w:r>
-            <w:r>
-              <w:rPr>
-                <w:sz w:val="24"/>
-                <w:szCs w:val="24"/>
-                <w:highlight w:val="none"/>
-              </w:rPr>
-            </w:r>
-            <w:r>
-              <w:rPr>
-                <w:sz w:val="24"/>
-                <w:szCs w:val="24"/>
-                <w:highlight w:val="none"/>
-                <w:lang w:val="uk-UA" w:bidi="uk-UA"/>
-              </w:rPr>
-            </w:r>
-            <w:r>
-              <w:rPr>
-                <w:sz w:val="24"/>
-                <w:szCs w:val="24"/>
-                <w:highlight w:val="none"/>
-                <w:lang w:val="uk-UA"/>
-              </w:rPr>
             </w:r>
             <w:r>
               <w:rPr>
@@ -5029,7 +4609,23 @@
                 <w:highlight w:val="none"/>
                 <w:lang w:val="uk-UA"/>
               </w:rPr>
-              <w:t xml:space="preserve">Команда для перестрибування на інструкцію яка вказана в наступній інструкції, наприклад 123. Так як в процесорі буде 8-бітний лічильник в одній інструкції не вистачить вільних бітів для того щоб передати 8-бітне число, тому воно буде передаватись наступною інструкцією.</w:t>
+              <w:t xml:space="preserve">Команда для п</w:t>
+            </w:r>
+            <w:r>
+              <w:rPr>
+                <w:sz w:val="24"/>
+                <w:szCs w:val="24"/>
+                <w:highlight w:val="none"/>
+                <w:lang w:val="uk-UA"/>
+              </w:rPr>
+              <w:t xml:space="preserve">ерестрибування на інструкцію яка вказана в наступній інструкції, наприклад 123. Так як в процесорі буде 8-бітний лічильник в одній інструкції не вистачить вільних бітів для того щоб передати 8-бітне число, тому воно буде передаватись наступною інструкцією.</w:t>
+            </w:r>
+            <w:r>
+              <w:rPr>
+                <w:sz w:val="24"/>
+                <w:szCs w:val="24"/>
+                <w:highlight w:val="none"/>
+              </w:rPr>
             </w:r>
             <w:r>
               <w:rPr>
@@ -5074,7 +4670,6 @@
                 <w:sz w:val="24"/>
                 <w:szCs w:val="24"/>
                 <w:highlight w:val="none"/>
-                <w:lang w:val="uk-UA"/>
               </w:rPr>
             </w:r>
             <w:r>
@@ -5123,15 +4718,6 @@
                 <w:sz w:val="24"/>
                 <w:szCs w:val="24"/>
                 <w:highlight w:val="none"/>
-                <w:lang w:val="uk-UA" w:bidi="uk-UA"/>
-              </w:rPr>
-            </w:r>
-            <w:r>
-              <w:rPr>
-                <w:sz w:val="24"/>
-                <w:szCs w:val="24"/>
-                <w:highlight w:val="none"/>
-                <w:lang w:val="uk-UA"/>
               </w:rPr>
             </w:r>
             <w:r>
@@ -5195,37 +4781,9 @@
               <w:rPr>
                 <w:sz w:val="24"/>
                 <w:szCs w:val="24"/>
-                <w:highlight w:val="none"/>
-              </w:rPr>
-            </w:r>
-            <w:r>
-              <w:rPr>
-                <w:sz w:val="24"/>
-                <w:szCs w:val="24"/>
-                <w:highlight w:val="none"/>
-                <w:lang w:val="uk-UA" w:bidi="uk-UA"/>
-              </w:rPr>
-            </w:r>
-            <w:r>
-              <w:rPr>
-                <w:sz w:val="24"/>
-                <w:szCs w:val="24"/>
-              </w:rPr>
-            </w:r>
-            <w:r>
-              <w:rPr>
-                <w:sz w:val="24"/>
-                <w:szCs w:val="24"/>
                 <w:lang w:val="uk-UA"/>
               </w:rPr>
               <w:t xml:space="preserve">123</w:t>
-            </w:r>
-            <w:r>
-              <w:rPr>
-                <w:sz w:val="24"/>
-                <w:szCs w:val="24"/>
-                <w:highlight w:val="none"/>
-              </w:rPr>
             </w:r>
             <w:r>
               <w:rPr>
@@ -5360,36 +4918,6 @@
                 <w:lang w:val="en-US"/>
               </w:rPr>
               <w:t xml:space="preserve">)</w:t>
-            </w:r>
-            <w:r>
-              <w:rPr>
-                <w:sz w:val="24"/>
-                <w:szCs w:val="24"/>
-                <w:highlight w:val="none"/>
-              </w:rPr>
-            </w:r>
-            <w:r>
-              <w:rPr>
-                <w:sz w:val="24"/>
-                <w:szCs w:val="24"/>
-                <w:highlight w:val="none"/>
-              </w:rPr>
-            </w:r>
-            <w:r>
-              <w:rPr>
-                <w:sz w:val="24"/>
-                <w:szCs w:val="24"/>
-                <w:highlight w:val="none"/>
-                <w:lang w:val="uk-UA" w:bidi="uk-UA"/>
-              </w:rPr>
-            </w:r>
-            <w:r>
-              <w:rPr>
-                <w:sz w:val="24"/>
-                <w:szCs w:val="24"/>
-                <w:highlight w:val="none"/>
-                <w:lang w:val="uk-UA"/>
-              </w:rPr>
             </w:r>
             <w:r>
               <w:rPr>
@@ -5432,6 +4960,13 @@
                 <w:lang w:val="uk-UA"/>
               </w:rPr>
               <w:t xml:space="preserve">Команда також переносить на вказану інструкцію але за умови що в вказаному регістрі буде 0.</w:t>
+            </w:r>
+            <w:r>
+              <w:rPr>
+                <w:sz w:val="24"/>
+                <w:szCs w:val="24"/>
+                <w:highlight w:val="none"/>
+              </w:rPr>
             </w:r>
             <w:r>
               <w:rPr>
@@ -5476,7 +5011,6 @@
                 <w:sz w:val="24"/>
                 <w:szCs w:val="24"/>
                 <w:highlight w:val="none"/>
-                <w:lang w:val="uk-UA"/>
               </w:rPr>
             </w:r>
             <w:r>
@@ -5525,15 +5059,6 @@
                 <w:sz w:val="24"/>
                 <w:szCs w:val="24"/>
                 <w:highlight w:val="none"/>
-                <w:lang w:val="uk-UA" w:bidi="uk-UA"/>
-              </w:rPr>
-            </w:r>
-            <w:r>
-              <w:rPr>
-                <w:sz w:val="24"/>
-                <w:szCs w:val="24"/>
-                <w:highlight w:val="none"/>
-                <w:lang w:val="uk-UA"/>
               </w:rPr>
             </w:r>
             <w:r>
@@ -5584,13 +5109,6 @@
                 <w:lang w:val="uk-UA"/>
               </w:rPr>
               <w:t xml:space="preserve"> </w:t>
-            </w:r>
-            <w:r>
-              <w:rPr>
-                <w:sz w:val="24"/>
-                <w:szCs w:val="24"/>
-                <w:highlight w:val="none"/>
-              </w:rPr>
             </w:r>
             <w:r>
               <w:rPr>
@@ -5838,6 +5356,11 @@
           <w:lang w:val="uk-UA"/>
         </w:rPr>
         <w:t xml:space="preserve">Також спочатку я хотів добавити апаратне множення та ділення, але це виявилося доволі затратно по транзисторах, тому я вирішив програмно відтворювати ці дві операції. </w:t>
+      </w:r>
+      <w:r>
+        <w:rPr>
+          <w14:ligatures w14:val="none"/>
+        </w:rPr>
       </w:r>
       <w:r>
         <w:rPr>

</xml_diff>